<commit_message>
Guia de TPs - Algoritmos de ordenamiento
</commit_message>
<xml_diff>
--- a/Códigos teoría/Guía de TPs/Práctica VII (Algoritmos de ordenamiento)/Resolución.docx
+++ b/Códigos teoría/Guía de TPs/Práctica VII (Algoritmos de ordenamiento)/Resolución.docx
@@ -44,6 +44,1905 @@
         </w:rPr>
         <w:br/>
         <w:t xml:space="preserve">B) </w:t>
+      </w:r>
+      <w:r>
+        <w:rPr>
+          <w:rFonts w:ascii="Arial" w:hAnsi="Arial" w:cs="Arial"/>
+          <w:lang w:val="es-ES"/>
+        </w:rPr>
+        <w:t>Inserción.</w:t>
+      </w:r>
+    </w:p>
+    <w:p>
+      <w:pPr>
+        <w:pStyle w:val="Prrafodelista"/>
+        <w:rPr>
+          <w:rFonts w:ascii="Arial" w:hAnsi="Arial" w:cs="Arial"/>
+          <w:lang w:val="es-ES"/>
+        </w:rPr>
+      </w:pPr>
+    </w:p>
+    <w:p>
+      <w:pPr>
+        <w:pStyle w:val="Prrafodelista"/>
+        <w:rPr>
+          <w:rFonts w:ascii="Arial" w:hAnsi="Arial" w:cs="Arial"/>
+          <w:lang w:val="es-ES"/>
+        </w:rPr>
+      </w:pPr>
+      <w:r>
+        <w:rPr>
+          <w:rFonts w:ascii="Arial" w:hAnsi="Arial" w:cs="Arial"/>
+          <w:lang w:val="es-ES"/>
+        </w:rPr>
+        <w:t>C) Los tres comparten la misma complejidad. La rapidez en sí podríamos delimitarla por cuál de los algoritmos tiene menos cantidad de comparaciones e intercambios (asignaciones). Inserción es un buen candidato a ser “rápido”, ya que tiene menos intercambios.</w:t>
+      </w:r>
+    </w:p>
+    <w:p>
+      <w:pPr>
+        <w:pStyle w:val="Prrafodelista"/>
+        <w:rPr>
+          <w:rFonts w:ascii="Arial" w:hAnsi="Arial" w:cs="Arial"/>
+          <w:lang w:val="es-ES"/>
+        </w:rPr>
+      </w:pPr>
+    </w:p>
+    <w:p>
+      <w:pPr>
+        <w:pStyle w:val="Prrafodelista"/>
+        <w:numPr>
+          <w:ilvl w:val="0"/>
+          <w:numId w:val="1"/>
+        </w:numPr>
+        <w:rPr>
+          <w:rFonts w:ascii="Arial" w:hAnsi="Arial" w:cs="Arial"/>
+          <w:lang w:val="es-ES"/>
+        </w:rPr>
+      </w:pPr>
+      <w:r>
+        <w:rPr>
+          <w:rFonts w:ascii="Arial" w:hAnsi="Arial" w:cs="Arial"/>
+          <w:lang w:val="es-ES"/>
+        </w:rPr>
+        <w:t>TODO: Shell, Cuenta de Distribución.</w:t>
+      </w:r>
+      <w:r>
+        <w:rPr>
+          <w:rFonts w:ascii="Arial" w:hAnsi="Arial" w:cs="Arial"/>
+          <w:lang w:val="es-ES"/>
+        </w:rPr>
+        <w:br/>
+      </w:r>
+    </w:p>
+    <w:p>
+      <w:pPr>
+        <w:pStyle w:val="Prrafodelista"/>
+        <w:numPr>
+          <w:ilvl w:val="0"/>
+          <w:numId w:val="1"/>
+        </w:numPr>
+        <w:rPr>
+          <w:rFonts w:ascii="Arial" w:hAnsi="Arial" w:cs="Arial"/>
+          <w:lang w:val="es-ES"/>
+        </w:rPr>
+      </w:pPr>
+      <w:r>
+        <w:rPr>
+          <w:rFonts w:ascii="Arial" w:hAnsi="Arial" w:cs="Arial"/>
+          <w:b/>
+          <w:lang w:val="es-ES"/>
+        </w:rPr>
+        <w:t>Estable:</w:t>
+      </w:r>
+      <w:r>
+        <w:rPr>
+          <w:rFonts w:ascii="Arial" w:hAnsi="Arial" w:cs="Arial"/>
+          <w:lang w:val="es-ES"/>
+        </w:rPr>
+        <w:t xml:space="preserve"> El orden relativo de las claves que sean iguales permanece invariante luego de haber sido ejecutado el algoritmo. </w:t>
+      </w:r>
+      <w:r>
+        <w:rPr>
+          <w:rFonts w:ascii="Arial" w:hAnsi="Arial" w:cs="Arial"/>
+          <w:lang w:val="es-ES"/>
+        </w:rPr>
+        <w:t>Como regla general, aquellos algoritmos que hagan intercambios que no sean contiguos, no son estables.</w:t>
+      </w:r>
+    </w:p>
+    <w:tbl>
+      <w:tblPr>
+        <w:tblStyle w:val="Tablaconcuadrcula"/>
+        <w:tblpPr w:leftFromText="180" w:rightFromText="180" w:vertAnchor="text" w:horzAnchor="margin" w:tblpXSpec="right" w:tblpY="1216"/>
+        <w:tblW w:w="0" w:type="auto"/>
+        <w:tblLook w:val="04A0" w:firstRow="1" w:lastRow="0" w:firstColumn="1" w:lastColumn="0" w:noHBand="0" w:noVBand="1"/>
+      </w:tblPr>
+      <w:tblGrid>
+        <w:gridCol w:w="2913"/>
+        <w:gridCol w:w="2851"/>
+        <w:gridCol w:w="2866"/>
+      </w:tblGrid>
+      <w:tr>
+        <w:tc>
+          <w:tcPr>
+            <w:tcW w:w="2913" w:type="dxa"/>
+            <w:shd w:val="clear" w:color="auto" w:fill="0070C0"/>
+          </w:tcPr>
+          <w:p>
+            <w:pPr>
+              <w:pStyle w:val="Prrafodelista"/>
+              <w:ind w:left="0"/>
+              <w:jc w:val="center"/>
+              <w:rPr>
+                <w:rFonts w:ascii="Arial" w:hAnsi="Arial" w:cs="Arial"/>
+                <w:b/>
+                <w:color w:val="FFFFFF" w:themeColor="background1"/>
+                <w:lang w:val="es-ES"/>
+              </w:rPr>
+            </w:pPr>
+            <w:r>
+              <w:rPr>
+                <w:rFonts w:ascii="Arial" w:hAnsi="Arial" w:cs="Arial"/>
+                <w:b/>
+                <w:color w:val="FFFFFF" w:themeColor="background1"/>
+                <w:lang w:val="es-ES"/>
+              </w:rPr>
+              <w:t>Algoritmo</w:t>
+            </w:r>
+          </w:p>
+        </w:tc>
+        <w:tc>
+          <w:tcPr>
+            <w:tcW w:w="2851" w:type="dxa"/>
+            <w:shd w:val="clear" w:color="auto" w:fill="0070C0"/>
+          </w:tcPr>
+          <w:p>
+            <w:pPr>
+              <w:pStyle w:val="Prrafodelista"/>
+              <w:ind w:left="0"/>
+              <w:jc w:val="center"/>
+              <w:rPr>
+                <w:rFonts w:ascii="Arial" w:hAnsi="Arial" w:cs="Arial"/>
+                <w:b/>
+                <w:color w:val="FFFFFF" w:themeColor="background1"/>
+                <w:lang w:val="es-ES"/>
+              </w:rPr>
+            </w:pPr>
+            <w:r>
+              <w:rPr>
+                <w:rFonts w:ascii="Arial" w:hAnsi="Arial" w:cs="Arial"/>
+                <w:b/>
+                <w:color w:val="FFFFFF" w:themeColor="background1"/>
+                <w:lang w:val="es-ES"/>
+              </w:rPr>
+              <w:t>Estable</w:t>
+            </w:r>
+          </w:p>
+        </w:tc>
+        <w:tc>
+          <w:tcPr>
+            <w:tcW w:w="2866" w:type="dxa"/>
+            <w:shd w:val="clear" w:color="auto" w:fill="0070C0"/>
+          </w:tcPr>
+          <w:p>
+            <w:pPr>
+              <w:pStyle w:val="Prrafodelista"/>
+              <w:ind w:left="0"/>
+              <w:jc w:val="center"/>
+              <w:rPr>
+                <w:rFonts w:ascii="Arial" w:hAnsi="Arial" w:cs="Arial"/>
+                <w:b/>
+                <w:color w:val="FFFFFF" w:themeColor="background1"/>
+                <w:lang w:val="es-ES"/>
+              </w:rPr>
+            </w:pPr>
+            <w:r>
+              <w:rPr>
+                <w:rFonts w:ascii="Arial" w:hAnsi="Arial" w:cs="Arial"/>
+                <w:b/>
+                <w:color w:val="FFFFFF" w:themeColor="background1"/>
+                <w:lang w:val="es-ES"/>
+              </w:rPr>
+              <w:t>Sensible</w:t>
+            </w:r>
+          </w:p>
+        </w:tc>
+      </w:tr>
+      <w:tr>
+        <w:tc>
+          <w:tcPr>
+            <w:tcW w:w="2913" w:type="dxa"/>
+          </w:tcPr>
+          <w:p>
+            <w:pPr>
+              <w:pStyle w:val="Prrafodelista"/>
+              <w:ind w:left="0"/>
+              <w:jc w:val="center"/>
+              <w:rPr>
+                <w:rFonts w:ascii="Arial" w:hAnsi="Arial" w:cs="Arial"/>
+                <w:lang w:val="es-ES"/>
+              </w:rPr>
+            </w:pPr>
+            <w:r>
+              <w:rPr>
+                <w:rFonts w:ascii="Arial" w:hAnsi="Arial" w:cs="Arial"/>
+                <w:lang w:val="es-ES"/>
+              </w:rPr>
+              <w:t>Burbujeo</w:t>
+            </w:r>
+          </w:p>
+        </w:tc>
+        <w:tc>
+          <w:tcPr>
+            <w:tcW w:w="2851" w:type="dxa"/>
+          </w:tcPr>
+          <w:p>
+            <w:pPr>
+              <w:pStyle w:val="Prrafodelista"/>
+              <w:ind w:left="0"/>
+              <w:jc w:val="center"/>
+              <w:rPr>
+                <w:rFonts w:ascii="Arial" w:hAnsi="Arial" w:cs="Arial"/>
+                <w:lang w:val="es-ES"/>
+              </w:rPr>
+            </w:pPr>
+            <w:r>
+              <w:rPr>
+                <w:rFonts w:ascii="Arial" w:hAnsi="Arial" w:cs="Arial"/>
+                <w:lang w:val="es-ES"/>
+              </w:rPr>
+              <w:t>Sí</w:t>
+            </w:r>
+          </w:p>
+        </w:tc>
+        <w:tc>
+          <w:tcPr>
+            <w:tcW w:w="2866" w:type="dxa"/>
+          </w:tcPr>
+          <w:p>
+            <w:pPr>
+              <w:pStyle w:val="Prrafodelista"/>
+              <w:ind w:left="0"/>
+              <w:jc w:val="center"/>
+              <w:rPr>
+                <w:rFonts w:ascii="Arial" w:hAnsi="Arial" w:cs="Arial"/>
+                <w:lang w:val="es-ES"/>
+              </w:rPr>
+            </w:pPr>
+            <w:r>
+              <w:rPr>
+                <w:rFonts w:ascii="Arial" w:hAnsi="Arial" w:cs="Arial"/>
+                <w:lang w:val="es-ES"/>
+              </w:rPr>
+              <w:t>Sí</w:t>
+            </w:r>
+          </w:p>
+        </w:tc>
+      </w:tr>
+      <w:tr>
+        <w:tc>
+          <w:tcPr>
+            <w:tcW w:w="2913" w:type="dxa"/>
+          </w:tcPr>
+          <w:p>
+            <w:pPr>
+              <w:pStyle w:val="Prrafodelista"/>
+              <w:ind w:left="0"/>
+              <w:jc w:val="center"/>
+              <w:rPr>
+                <w:rFonts w:ascii="Arial" w:hAnsi="Arial" w:cs="Arial"/>
+                <w:lang w:val="es-ES"/>
+              </w:rPr>
+            </w:pPr>
+            <w:r>
+              <w:rPr>
+                <w:rFonts w:ascii="Arial" w:hAnsi="Arial" w:cs="Arial"/>
+                <w:lang w:val="es-ES"/>
+              </w:rPr>
+              <w:t>Inserción</w:t>
+            </w:r>
+          </w:p>
+        </w:tc>
+        <w:tc>
+          <w:tcPr>
+            <w:tcW w:w="2851" w:type="dxa"/>
+          </w:tcPr>
+          <w:p>
+            <w:pPr>
+              <w:pStyle w:val="Prrafodelista"/>
+              <w:ind w:left="0"/>
+              <w:jc w:val="center"/>
+              <w:rPr>
+                <w:rFonts w:ascii="Arial" w:hAnsi="Arial" w:cs="Arial"/>
+                <w:lang w:val="es-ES"/>
+              </w:rPr>
+            </w:pPr>
+            <w:r>
+              <w:rPr>
+                <w:rFonts w:ascii="Arial" w:hAnsi="Arial" w:cs="Arial"/>
+                <w:lang w:val="es-ES"/>
+              </w:rPr>
+              <w:t>Sí</w:t>
+            </w:r>
+          </w:p>
+        </w:tc>
+        <w:tc>
+          <w:tcPr>
+            <w:tcW w:w="2866" w:type="dxa"/>
+          </w:tcPr>
+          <w:p>
+            <w:pPr>
+              <w:pStyle w:val="Prrafodelista"/>
+              <w:ind w:left="0"/>
+              <w:jc w:val="center"/>
+              <w:rPr>
+                <w:rFonts w:ascii="Arial" w:hAnsi="Arial" w:cs="Arial"/>
+                <w:lang w:val="es-ES"/>
+              </w:rPr>
+            </w:pPr>
+            <w:r>
+              <w:rPr>
+                <w:rFonts w:ascii="Arial" w:hAnsi="Arial" w:cs="Arial"/>
+                <w:lang w:val="es-ES"/>
+              </w:rPr>
+              <w:t>Sí</w:t>
+            </w:r>
+          </w:p>
+        </w:tc>
+      </w:tr>
+      <w:tr>
+        <w:tc>
+          <w:tcPr>
+            <w:tcW w:w="2913" w:type="dxa"/>
+          </w:tcPr>
+          <w:p>
+            <w:pPr>
+              <w:pStyle w:val="Prrafodelista"/>
+              <w:ind w:left="0"/>
+              <w:jc w:val="center"/>
+              <w:rPr>
+                <w:rFonts w:ascii="Arial" w:hAnsi="Arial" w:cs="Arial"/>
+                <w:lang w:val="es-ES"/>
+              </w:rPr>
+            </w:pPr>
+            <w:r>
+              <w:rPr>
+                <w:rFonts w:ascii="Arial" w:hAnsi="Arial" w:cs="Arial"/>
+                <w:lang w:val="es-ES"/>
+              </w:rPr>
+              <w:t>Selección</w:t>
+            </w:r>
+          </w:p>
+        </w:tc>
+        <w:tc>
+          <w:tcPr>
+            <w:tcW w:w="2851" w:type="dxa"/>
+          </w:tcPr>
+          <w:p>
+            <w:pPr>
+              <w:pStyle w:val="Prrafodelista"/>
+              <w:ind w:left="0"/>
+              <w:jc w:val="center"/>
+              <w:rPr>
+                <w:rFonts w:ascii="Arial" w:hAnsi="Arial" w:cs="Arial"/>
+                <w:lang w:val="es-ES"/>
+              </w:rPr>
+            </w:pPr>
+            <w:r>
+              <w:rPr>
+                <w:rFonts w:ascii="Arial" w:hAnsi="Arial" w:cs="Arial"/>
+                <w:lang w:val="es-ES"/>
+              </w:rPr>
+              <w:t>No</w:t>
+            </w:r>
+          </w:p>
+        </w:tc>
+        <w:tc>
+          <w:tcPr>
+            <w:tcW w:w="2866" w:type="dxa"/>
+          </w:tcPr>
+          <w:p>
+            <w:pPr>
+              <w:pStyle w:val="Prrafodelista"/>
+              <w:ind w:left="0"/>
+              <w:jc w:val="center"/>
+              <w:rPr>
+                <w:rFonts w:ascii="Arial" w:hAnsi="Arial" w:cs="Arial"/>
+                <w:lang w:val="es-ES"/>
+              </w:rPr>
+            </w:pPr>
+            <w:r>
+              <w:rPr>
+                <w:rFonts w:ascii="Arial" w:hAnsi="Arial" w:cs="Arial"/>
+                <w:lang w:val="es-ES"/>
+              </w:rPr>
+              <w:t>No</w:t>
+            </w:r>
+          </w:p>
+        </w:tc>
+      </w:tr>
+      <w:tr>
+        <w:tc>
+          <w:tcPr>
+            <w:tcW w:w="2913" w:type="dxa"/>
+          </w:tcPr>
+          <w:p>
+            <w:pPr>
+              <w:pStyle w:val="Prrafodelista"/>
+              <w:ind w:left="0"/>
+              <w:jc w:val="center"/>
+              <w:rPr>
+                <w:rFonts w:ascii="Arial" w:hAnsi="Arial" w:cs="Arial"/>
+                <w:lang w:val="es-ES"/>
+              </w:rPr>
+            </w:pPr>
+            <w:r>
+              <w:rPr>
+                <w:rFonts w:ascii="Arial" w:hAnsi="Arial" w:cs="Arial"/>
+                <w:lang w:val="es-ES"/>
+              </w:rPr>
+              <w:t>QuickSort</w:t>
+            </w:r>
+          </w:p>
+        </w:tc>
+        <w:tc>
+          <w:tcPr>
+            <w:tcW w:w="2851" w:type="dxa"/>
+          </w:tcPr>
+          <w:p>
+            <w:pPr>
+              <w:pStyle w:val="Prrafodelista"/>
+              <w:ind w:left="0"/>
+              <w:jc w:val="center"/>
+              <w:rPr>
+                <w:rFonts w:ascii="Arial" w:hAnsi="Arial" w:cs="Arial"/>
+                <w:lang w:val="es-ES"/>
+              </w:rPr>
+            </w:pPr>
+            <w:r>
+              <w:rPr>
+                <w:rFonts w:ascii="Arial" w:hAnsi="Arial" w:cs="Arial"/>
+                <w:lang w:val="es-ES"/>
+              </w:rPr>
+              <w:t>No</w:t>
+            </w:r>
+          </w:p>
+        </w:tc>
+        <w:tc>
+          <w:tcPr>
+            <w:tcW w:w="2866" w:type="dxa"/>
+          </w:tcPr>
+          <w:p>
+            <w:pPr>
+              <w:pStyle w:val="Prrafodelista"/>
+              <w:ind w:left="0"/>
+              <w:jc w:val="center"/>
+              <w:rPr>
+                <w:rFonts w:ascii="Arial" w:hAnsi="Arial" w:cs="Arial"/>
+                <w:lang w:val="es-ES"/>
+              </w:rPr>
+            </w:pPr>
+            <w:r>
+              <w:rPr>
+                <w:rFonts w:ascii="Arial" w:hAnsi="Arial" w:cs="Arial"/>
+                <w:lang w:val="es-ES"/>
+              </w:rPr>
+              <w:t>No</w:t>
+            </w:r>
+          </w:p>
+        </w:tc>
+      </w:tr>
+      <w:tr>
+        <w:tc>
+          <w:tcPr>
+            <w:tcW w:w="2913" w:type="dxa"/>
+          </w:tcPr>
+          <w:p>
+            <w:pPr>
+              <w:pStyle w:val="Prrafodelista"/>
+              <w:ind w:left="0"/>
+              <w:jc w:val="center"/>
+              <w:rPr>
+                <w:rFonts w:ascii="Arial" w:hAnsi="Arial" w:cs="Arial"/>
+                <w:lang w:val="es-ES"/>
+              </w:rPr>
+            </w:pPr>
+            <w:r>
+              <w:rPr>
+                <w:rFonts w:ascii="Arial" w:hAnsi="Arial" w:cs="Arial"/>
+                <w:lang w:val="es-ES"/>
+              </w:rPr>
+              <w:t>MergeSort</w:t>
+            </w:r>
+          </w:p>
+        </w:tc>
+        <w:tc>
+          <w:tcPr>
+            <w:tcW w:w="2851" w:type="dxa"/>
+          </w:tcPr>
+          <w:p>
+            <w:pPr>
+              <w:pStyle w:val="Prrafodelista"/>
+              <w:ind w:left="0"/>
+              <w:jc w:val="center"/>
+              <w:rPr>
+                <w:rFonts w:ascii="Arial" w:hAnsi="Arial" w:cs="Arial"/>
+                <w:lang w:val="es-ES"/>
+              </w:rPr>
+            </w:pPr>
+            <w:r>
+              <w:rPr>
+                <w:rFonts w:ascii="Arial" w:hAnsi="Arial" w:cs="Arial"/>
+                <w:lang w:val="es-ES"/>
+              </w:rPr>
+              <w:t>Sí</w:t>
+            </w:r>
+          </w:p>
+        </w:tc>
+        <w:tc>
+          <w:tcPr>
+            <w:tcW w:w="2866" w:type="dxa"/>
+          </w:tcPr>
+          <w:p>
+            <w:pPr>
+              <w:pStyle w:val="Prrafodelista"/>
+              <w:ind w:left="0"/>
+              <w:jc w:val="center"/>
+              <w:rPr>
+                <w:rFonts w:ascii="Arial" w:hAnsi="Arial" w:cs="Arial"/>
+                <w:lang w:val="es-ES"/>
+              </w:rPr>
+            </w:pPr>
+            <w:r>
+              <w:rPr>
+                <w:rFonts w:ascii="Arial" w:hAnsi="Arial" w:cs="Arial"/>
+                <w:lang w:val="es-ES"/>
+              </w:rPr>
+              <w:t>No</w:t>
+            </w:r>
+          </w:p>
+        </w:tc>
+      </w:tr>
+      <w:tr>
+        <w:tc>
+          <w:tcPr>
+            <w:tcW w:w="2913" w:type="dxa"/>
+          </w:tcPr>
+          <w:p>
+            <w:pPr>
+              <w:pStyle w:val="Prrafodelista"/>
+              <w:ind w:left="0"/>
+              <w:jc w:val="center"/>
+              <w:rPr>
+                <w:rFonts w:ascii="Arial" w:hAnsi="Arial" w:cs="Arial"/>
+                <w:lang w:val="es-ES"/>
+              </w:rPr>
+            </w:pPr>
+            <w:r>
+              <w:rPr>
+                <w:rFonts w:ascii="Arial" w:hAnsi="Arial" w:cs="Arial"/>
+                <w:lang w:val="es-ES"/>
+              </w:rPr>
+              <w:t>ShellSort</w:t>
+            </w:r>
+          </w:p>
+        </w:tc>
+        <w:tc>
+          <w:tcPr>
+            <w:tcW w:w="2851" w:type="dxa"/>
+          </w:tcPr>
+          <w:p>
+            <w:pPr>
+              <w:pStyle w:val="Prrafodelista"/>
+              <w:ind w:left="0"/>
+              <w:jc w:val="center"/>
+              <w:rPr>
+                <w:rFonts w:ascii="Arial" w:hAnsi="Arial" w:cs="Arial"/>
+                <w:lang w:val="es-ES"/>
+              </w:rPr>
+            </w:pPr>
+            <w:r>
+              <w:rPr>
+                <w:rFonts w:ascii="Arial" w:hAnsi="Arial" w:cs="Arial"/>
+                <w:lang w:val="es-ES"/>
+              </w:rPr>
+              <w:t>No</w:t>
+            </w:r>
+          </w:p>
+        </w:tc>
+        <w:tc>
+          <w:tcPr>
+            <w:tcW w:w="2866" w:type="dxa"/>
+          </w:tcPr>
+          <w:p>
+            <w:pPr>
+              <w:pStyle w:val="Prrafodelista"/>
+              <w:ind w:left="0"/>
+              <w:jc w:val="center"/>
+              <w:rPr>
+                <w:rFonts w:ascii="Arial" w:hAnsi="Arial" w:cs="Arial"/>
+                <w:lang w:val="es-ES"/>
+              </w:rPr>
+            </w:pPr>
+            <w:r>
+              <w:rPr>
+                <w:rFonts w:ascii="Arial" w:hAnsi="Arial" w:cs="Arial"/>
+                <w:lang w:val="es-ES"/>
+              </w:rPr>
+              <w:t>Sí</w:t>
+            </w:r>
+          </w:p>
+        </w:tc>
+      </w:tr>
+      <w:tr>
+        <w:tc>
+          <w:tcPr>
+            <w:tcW w:w="2913" w:type="dxa"/>
+          </w:tcPr>
+          <w:p>
+            <w:pPr>
+              <w:pStyle w:val="Prrafodelista"/>
+              <w:ind w:left="0"/>
+              <w:jc w:val="center"/>
+              <w:rPr>
+                <w:rFonts w:ascii="Arial" w:hAnsi="Arial" w:cs="Arial"/>
+                <w:lang w:val="es-ES"/>
+              </w:rPr>
+            </w:pPr>
+            <w:r>
+              <w:rPr>
+                <w:rFonts w:ascii="Arial" w:hAnsi="Arial" w:cs="Arial"/>
+                <w:lang w:val="es-ES"/>
+              </w:rPr>
+              <w:t>CountingSort</w:t>
+            </w:r>
+          </w:p>
+        </w:tc>
+        <w:tc>
+          <w:tcPr>
+            <w:tcW w:w="2851" w:type="dxa"/>
+          </w:tcPr>
+          <w:p>
+            <w:pPr>
+              <w:pStyle w:val="Prrafodelista"/>
+              <w:ind w:left="0"/>
+              <w:jc w:val="center"/>
+              <w:rPr>
+                <w:rFonts w:ascii="Arial" w:hAnsi="Arial" w:cs="Arial"/>
+                <w:lang w:val="es-ES"/>
+              </w:rPr>
+            </w:pPr>
+            <w:r>
+              <w:rPr>
+                <w:rFonts w:ascii="Arial" w:hAnsi="Arial" w:cs="Arial"/>
+                <w:lang w:val="es-ES"/>
+              </w:rPr>
+              <w:t>Sí</w:t>
+            </w:r>
+          </w:p>
+        </w:tc>
+        <w:tc>
+          <w:tcPr>
+            <w:tcW w:w="2866" w:type="dxa"/>
+          </w:tcPr>
+          <w:p>
+            <w:pPr>
+              <w:pStyle w:val="Prrafodelista"/>
+              <w:ind w:left="0"/>
+              <w:jc w:val="center"/>
+              <w:rPr>
+                <w:rFonts w:ascii="Arial" w:hAnsi="Arial" w:cs="Arial"/>
+                <w:lang w:val="es-ES"/>
+              </w:rPr>
+            </w:pPr>
+            <w:r>
+              <w:rPr>
+                <w:rFonts w:ascii="Arial" w:hAnsi="Arial" w:cs="Arial"/>
+                <w:lang w:val="es-ES"/>
+              </w:rPr>
+              <w:t>No</w:t>
+            </w:r>
+          </w:p>
+        </w:tc>
+      </w:tr>
+    </w:tbl>
+    <w:p>
+      <w:pPr>
+        <w:pStyle w:val="Prrafodelista"/>
+        <w:rPr>
+          <w:rFonts w:ascii="Arial" w:hAnsi="Arial" w:cs="Arial"/>
+          <w:lang w:val="es-ES"/>
+        </w:rPr>
+      </w:pPr>
+      <w:r>
+        <w:rPr>
+          <w:rFonts w:ascii="Arial" w:hAnsi="Arial" w:cs="Arial"/>
+          <w:lang w:val="es-ES"/>
+        </w:rPr>
+        <w:br/>
+      </w:r>
+      <w:r>
+        <w:rPr>
+          <w:rFonts w:ascii="Arial" w:hAnsi="Arial" w:cs="Arial"/>
+          <w:b/>
+          <w:lang w:val="es-ES"/>
+        </w:rPr>
+        <w:t>Sensible:</w:t>
+      </w:r>
+      <w:r>
+        <w:rPr>
+          <w:rFonts w:ascii="Arial" w:hAnsi="Arial" w:cs="Arial"/>
+          <w:lang w:val="es-ES"/>
+        </w:rPr>
+        <w:t xml:space="preserve"> El algoritmo es más o menos efici</w:t>
+      </w:r>
+      <w:r>
+        <w:rPr>
+          <w:rFonts w:ascii="Arial" w:hAnsi="Arial" w:cs="Arial"/>
+          <w:lang w:val="es-ES"/>
+        </w:rPr>
+        <w:t xml:space="preserve">ente dependiendo de cómo </w:t>
+      </w:r>
+      <w:r>
+        <w:rPr>
+          <w:rFonts w:ascii="Arial" w:hAnsi="Arial" w:cs="Arial"/>
+          <w:lang w:val="es-ES"/>
+        </w:rPr>
+        <w:t>esté</w:t>
+      </w:r>
+      <w:r>
+        <w:rPr>
+          <w:rFonts w:ascii="Arial" w:hAnsi="Arial" w:cs="Arial"/>
+          <w:lang w:val="es-ES"/>
+        </w:rPr>
+        <w:t xml:space="preserve"> </w:t>
+      </w:r>
+      <w:r>
+        <w:rPr>
+          <w:rFonts w:ascii="Arial" w:hAnsi="Arial" w:cs="Arial"/>
+          <w:lang w:val="es-ES"/>
+        </w:rPr>
+        <w:t>la entrada (e.g. la entrada está ordenada, desordenada, al azar, etc.).</w:t>
+      </w:r>
+      <w:r>
+        <w:rPr>
+          <w:rFonts w:ascii="Arial" w:hAnsi="Arial" w:cs="Arial"/>
+          <w:lang w:val="es-ES"/>
+        </w:rPr>
+        <w:br/>
+      </w:r>
+      <w:r>
+        <w:rPr>
+          <w:rFonts w:ascii="Arial" w:hAnsi="Arial" w:cs="Arial"/>
+          <w:lang w:val="es-ES"/>
+        </w:rPr>
+        <w:br/>
+      </w:r>
+    </w:p>
+    <w:p>
+      <w:pPr>
+        <w:pStyle w:val="Prrafodelista"/>
+        <w:numPr>
+          <w:ilvl w:val="0"/>
+          <w:numId w:val="1"/>
+        </w:numPr>
+        <w:rPr>
+          <w:rFonts w:ascii="Arial" w:hAnsi="Arial" w:cs="Arial"/>
+          <w:lang w:val="es-ES"/>
+        </w:rPr>
+      </w:pPr>
+      <w:r>
+        <w:rPr>
+          <w:rFonts w:ascii="Arial" w:hAnsi="Arial" w:cs="Arial"/>
+          <w:lang w:val="es-ES"/>
+        </w:rPr>
+        <w:t>^</w:t>
+      </w:r>
+      <w:r>
+        <w:rPr>
+          <w:rFonts w:ascii="Arial" w:hAnsi="Arial" w:cs="Arial"/>
+          <w:lang w:val="es-ES"/>
+        </w:rPr>
+        <w:br/>
+      </w:r>
+    </w:p>
+    <w:p>
+      <w:pPr>
+        <w:pStyle w:val="Prrafodelista"/>
+        <w:numPr>
+          <w:ilvl w:val="0"/>
+          <w:numId w:val="1"/>
+        </w:numPr>
+        <w:rPr>
+          <w:rFonts w:ascii="Arial" w:hAnsi="Arial" w:cs="Arial"/>
+          <w:lang w:val="es-ES"/>
+        </w:rPr>
+      </w:pPr>
+      <w:r>
+        <w:rPr>
+          <w:rFonts w:ascii="Arial" w:hAnsi="Arial" w:cs="Arial"/>
+          <w:lang w:val="es-ES"/>
+        </w:rPr>
+        <w:t>.</w:t>
+      </w:r>
+      <w:r>
+        <w:rPr>
+          <w:rFonts w:ascii="Arial" w:hAnsi="Arial" w:cs="Arial"/>
+          <w:lang w:val="es-ES"/>
+        </w:rPr>
+        <w:br/>
+      </w:r>
+    </w:p>
+    <w:p>
+      <w:pPr>
+        <w:pStyle w:val="Prrafodelista"/>
+        <w:numPr>
+          <w:ilvl w:val="0"/>
+          <w:numId w:val="1"/>
+        </w:numPr>
+        <w:rPr>
+          <w:rFonts w:ascii="Arial" w:hAnsi="Arial" w:cs="Arial"/>
+          <w:lang w:val="es-ES"/>
+        </w:rPr>
+      </w:pPr>
+      <w:r>
+        <w:rPr>
+          <w:rFonts w:ascii="Arial" w:hAnsi="Arial" w:cs="Arial"/>
+          <w:lang w:val="es-ES"/>
+        </w:rPr>
+        <w:t xml:space="preserve">TODO </w:t>
+      </w:r>
+      <w:r>
+        <w:rPr>
+          <w:rFonts w:ascii="Arial" w:hAnsi="Arial" w:cs="Arial"/>
+          <w:lang w:val="es-ES"/>
+        </w:rPr>
+        <w:br/>
+      </w:r>
+    </w:p>
+    <w:p>
+      <w:pPr>
+        <w:pStyle w:val="Prrafodelista"/>
+        <w:numPr>
+          <w:ilvl w:val="0"/>
+          <w:numId w:val="1"/>
+        </w:numPr>
+        <w:spacing w:before="100" w:beforeAutospacing="1" w:after="100" w:afterAutospacing="1" w:line="240" w:lineRule="auto"/>
+        <w:rPr>
+          <w:rFonts w:ascii="Arial" w:eastAsia="Times New Roman" w:hAnsi="Arial" w:cs="Arial"/>
+        </w:rPr>
+      </w:pPr>
+      <w:r>
+        <w:rPr>
+          <w:rFonts w:ascii="Arial" w:eastAsia="Times New Roman" w:hAnsi="Arial" w:cs="Arial"/>
+          <w:lang w:val="es-ES"/>
+        </w:rPr>
+        <w:t xml:space="preserve">Las dos características teóricas principales de los algoritmos de clasificación son la complejidad del tiempo y la complejidad del espacio. </w:t>
+      </w:r>
+    </w:p>
+    <w:p>
+      <w:pPr>
+        <w:pStyle w:val="Prrafodelista"/>
+        <w:spacing w:before="100" w:beforeAutospacing="1" w:after="100" w:afterAutospacing="1" w:line="240" w:lineRule="auto"/>
+        <w:rPr>
+          <w:rFonts w:ascii="Arial" w:eastAsia="Times New Roman" w:hAnsi="Arial" w:cs="Arial"/>
+        </w:rPr>
+      </w:pPr>
+    </w:p>
+    <w:p>
+      <w:pPr>
+        <w:pStyle w:val="Prrafodelista"/>
+        <w:spacing w:before="100" w:beforeAutospacing="1" w:after="100" w:afterAutospacing="1" w:line="240" w:lineRule="auto"/>
+        <w:rPr>
+          <w:rFonts w:ascii="Arial" w:eastAsia="Times New Roman" w:hAnsi="Arial" w:cs="Arial"/>
+          <w:lang w:val="es-ES"/>
+        </w:rPr>
+      </w:pPr>
+      <w:r>
+        <w:rPr>
+          <w:rFonts w:ascii="Arial" w:eastAsia="Times New Roman" w:hAnsi="Arial" w:cs="Arial"/>
+          <w:lang w:val="es-ES"/>
+        </w:rPr>
+        <w:t xml:space="preserve">En general, </w:t>
+      </w:r>
+      <w:r>
+        <w:rPr>
+          <w:rFonts w:ascii="Arial" w:eastAsia="Times New Roman" w:hAnsi="Arial" w:cs="Arial"/>
+          <w:color w:val="000000" w:themeColor="text1"/>
+          <w:lang w:val="es-ES"/>
+        </w:rPr>
+        <w:t>complejidad del tiempo</w:t>
+      </w:r>
+      <w:r>
+        <w:rPr>
+          <w:rFonts w:ascii="Arial" w:eastAsia="Times New Roman" w:hAnsi="Arial" w:cs="Arial"/>
+          <w:color w:val="000000" w:themeColor="text1"/>
+          <w:lang w:val="es-ES"/>
+        </w:rPr>
+        <w:t> </w:t>
+      </w:r>
+      <w:r>
+        <w:rPr>
+          <w:rFonts w:ascii="Arial" w:eastAsia="Times New Roman" w:hAnsi="Arial" w:cs="Arial"/>
+          <w:lang w:val="es-ES"/>
+        </w:rPr>
+        <w:t>nos permite saber cómo cambia el rendimiento del algoritmo a medida que aumenta el tamaño del conjunto de datos. Cosas para considerar:</w:t>
+      </w:r>
+    </w:p>
+    <w:p>
+      <w:pPr>
+        <w:numPr>
+          <w:ilvl w:val="0"/>
+          <w:numId w:val="2"/>
+        </w:numPr>
+        <w:spacing w:before="100" w:beforeAutospacing="1" w:after="100" w:afterAutospacing="1" w:line="240" w:lineRule="auto"/>
+        <w:rPr>
+          <w:rFonts w:ascii="Arial" w:eastAsia="Times New Roman" w:hAnsi="Arial" w:cs="Arial"/>
+          <w:lang w:val="es-ES"/>
+        </w:rPr>
+      </w:pPr>
+      <w:r>
+        <w:rPr>
+          <w:rFonts w:ascii="Arial" w:eastAsia="Times New Roman" w:hAnsi="Arial" w:cs="Arial"/>
+          <w:b/>
+          <w:bCs/>
+          <w:lang w:val="es-ES"/>
+        </w:rPr>
+        <w:t>¿Cuántos datos esperas ordenar?</w:t>
+      </w:r>
+      <w:r>
+        <w:rPr>
+          <w:rFonts w:ascii="Arial" w:eastAsia="Times New Roman" w:hAnsi="Arial" w:cs="Arial"/>
+          <w:lang w:val="es-ES"/>
+        </w:rPr>
+        <w:t> Esto lo ayudará a saber si necesita buscar un algoritmo con una complejidad de tiempo muy baja.</w:t>
+      </w:r>
+    </w:p>
+    <w:p>
+      <w:pPr>
+        <w:numPr>
+          <w:ilvl w:val="0"/>
+          <w:numId w:val="2"/>
+        </w:numPr>
+        <w:spacing w:before="100" w:beforeAutospacing="1" w:after="100" w:afterAutospacing="1" w:line="240" w:lineRule="auto"/>
+        <w:rPr>
+          <w:rFonts w:ascii="Arial" w:eastAsia="Times New Roman" w:hAnsi="Arial" w:cs="Arial"/>
+          <w:lang w:val="es-ES"/>
+        </w:rPr>
+      </w:pPr>
+      <w:r>
+        <w:rPr>
+          <w:rFonts w:ascii="Arial" w:eastAsia="Times New Roman" w:hAnsi="Arial" w:cs="Arial"/>
+          <w:b/>
+          <w:bCs/>
+          <w:lang w:val="es-ES"/>
+        </w:rPr>
+        <w:t>¿Qué tan ordenados serán sus datos?</w:t>
+      </w:r>
+      <w:r>
+        <w:rPr>
+          <w:rFonts w:ascii="Arial" w:eastAsia="Times New Roman" w:hAnsi="Arial" w:cs="Arial"/>
+          <w:lang w:val="es-ES"/>
+        </w:rPr>
+        <w:t xml:space="preserve"> ¿Estará parcialmente ordenado? </w:t>
+      </w:r>
+      <w:r>
+        <w:rPr>
+          <w:rFonts w:ascii="Arial" w:eastAsia="Times New Roman" w:hAnsi="Arial" w:cs="Arial"/>
+          <w:lang w:val="es-ES"/>
+        </w:rPr>
+        <w:t>¿</w:t>
+      </w:r>
+      <w:r>
+        <w:rPr>
+          <w:rFonts w:ascii="Arial" w:eastAsia="Times New Roman" w:hAnsi="Arial" w:cs="Arial"/>
+          <w:lang w:val="es-ES"/>
+        </w:rPr>
+        <w:t>Aleatoriamente ordenado? Esto puede afectar la complejidad del tiempo del algoritmo de clasificación. La mayoría de los algoritmos tendrán el peor y el mejor de los casos: desea asegurarse de que no esté utilizando un algoritmo en el conjunto de datos del peor de los casos.</w:t>
+      </w:r>
+    </w:p>
+    <w:p>
+      <w:pPr>
+        <w:numPr>
+          <w:ilvl w:val="0"/>
+          <w:numId w:val="2"/>
+        </w:numPr>
+        <w:spacing w:before="100" w:beforeAutospacing="1" w:after="100" w:afterAutospacing="1" w:line="240" w:lineRule="auto"/>
+        <w:rPr>
+          <w:rFonts w:ascii="Arial" w:eastAsia="Times New Roman" w:hAnsi="Arial" w:cs="Arial"/>
+          <w:lang w:val="es-ES"/>
+        </w:rPr>
+      </w:pPr>
+      <w:r>
+        <w:rPr>
+          <w:rFonts w:ascii="Arial" w:eastAsia="Times New Roman" w:hAnsi="Arial" w:cs="Arial"/>
+          <w:b/>
+          <w:bCs/>
+          <w:lang w:val="es-ES"/>
+        </w:rPr>
+        <w:lastRenderedPageBreak/>
+        <w:t>La complejidad del tiempo no es lo mismo que el tiempo de ejecución.</w:t>
+      </w:r>
+      <w:r>
+        <w:rPr>
+          <w:rFonts w:ascii="Arial" w:eastAsia="Times New Roman" w:hAnsi="Arial" w:cs="Arial"/>
+          <w:lang w:val="es-ES"/>
+        </w:rPr>
+        <w:t xml:space="preserve"> Recuerde que la complejidad del tiempo solo describe cómo varía el rendimiento de un algoritmo a medida que aumenta el tamaño del conjunto de datos. Un algoritmo que siempre pasa por una sola vez sobre toda la entrada sería O (n) - su rendimiento se correlaciona linealmente con el tamaño de la entrada. Pero, un algoritmo que siempre hace dos pasadas sobre el conjunto de datos también es O (n) - la correlación sigue siendo lineal, incluso si la constante (y el tiempo real de ejecución) es diferente. </w:t>
+      </w:r>
+    </w:p>
+    <w:p>
+      <w:pPr>
+        <w:spacing w:before="100" w:beforeAutospacing="1" w:after="100" w:afterAutospacing="1" w:line="240" w:lineRule="auto"/>
+        <w:rPr>
+          <w:rFonts w:ascii="Arial" w:eastAsia="Times New Roman" w:hAnsi="Arial" w:cs="Arial"/>
+          <w:lang w:val="es-ES"/>
+        </w:rPr>
+      </w:pPr>
+      <w:r>
+        <w:rPr>
+          <w:rFonts w:ascii="Arial" w:eastAsia="Times New Roman" w:hAnsi="Arial" w:cs="Arial"/>
+          <w:lang w:val="es-ES"/>
+        </w:rPr>
+        <w:t xml:space="preserve">De forma similar, la complejidad del espacio describe la cantidad de espacio que necesita ejecutar un algoritmo. Por ejemplo, un tipo simple como </w:t>
+      </w:r>
+      <w:r>
+        <w:rPr>
+          <w:rFonts w:ascii="Arial" w:eastAsia="Times New Roman" w:hAnsi="Arial" w:cs="Arial"/>
+          <w:color w:val="000000" w:themeColor="text1"/>
+          <w:lang w:val="es-ES"/>
+        </w:rPr>
+        <w:t>tipo de inserción</w:t>
+      </w:r>
+      <w:r>
+        <w:rPr>
+          <w:rFonts w:ascii="Arial" w:eastAsia="Times New Roman" w:hAnsi="Arial" w:cs="Arial"/>
+          <w:color w:val="000000" w:themeColor="text1"/>
+          <w:lang w:val="es-ES"/>
+        </w:rPr>
+        <w:t> </w:t>
+      </w:r>
+      <w:r>
+        <w:rPr>
+          <w:rFonts w:ascii="Arial" w:eastAsia="Times New Roman" w:hAnsi="Arial" w:cs="Arial"/>
+          <w:lang w:val="es-ES"/>
+        </w:rPr>
+        <w:t xml:space="preserve">necesita una cantidad fija adicional de espacio para almacenar el valor del elemento que se está insertando actualmente. Esta es una complejidad de espacio auxiliar de O (1) - no cambia con el tamaño de la entrada. Sin embargo, </w:t>
+      </w:r>
+      <w:r>
+        <w:rPr>
+          <w:rFonts w:ascii="Arial" w:eastAsia="Times New Roman" w:hAnsi="Arial" w:cs="Arial"/>
+          <w:color w:val="000000" w:themeColor="text1"/>
+          <w:lang w:val="es-ES"/>
+        </w:rPr>
+        <w:t>tipo de fusión</w:t>
+      </w:r>
+      <w:r>
+        <w:rPr>
+          <w:rFonts w:ascii="Arial" w:eastAsia="Times New Roman" w:hAnsi="Arial" w:cs="Arial"/>
+          <w:color w:val="000000" w:themeColor="text1"/>
+          <w:lang w:val="es-ES"/>
+        </w:rPr>
+        <w:t> </w:t>
+      </w:r>
+      <w:r>
+        <w:rPr>
+          <w:rFonts w:ascii="Arial" w:eastAsia="Times New Roman" w:hAnsi="Arial" w:cs="Arial"/>
+          <w:lang w:val="es-ES"/>
+        </w:rPr>
+        <w:t>crea matrices adicionales en la memoria mientras se ejecuta, con una complejidad de espacio auxiliar de O (n). Esto significa que la cantidad de espacio adicional que requiere se correlaciona linealmente con el tamaño de la entrada.</w:t>
+      </w:r>
+    </w:p>
+    <w:p>
+      <w:pPr>
+        <w:spacing w:before="100" w:beforeAutospacing="1" w:after="100" w:afterAutospacing="1" w:line="240" w:lineRule="auto"/>
+        <w:rPr>
+          <w:rFonts w:ascii="Arial" w:eastAsia="Times New Roman" w:hAnsi="Arial" w:cs="Arial"/>
+          <w:lang w:val="es-ES"/>
+        </w:rPr>
+      </w:pPr>
+      <w:r>
+        <w:rPr>
+          <w:rFonts w:ascii="Arial" w:eastAsia="Times New Roman" w:hAnsi="Arial" w:cs="Arial"/>
+          <w:lang w:val="es-ES"/>
+        </w:rPr>
+        <w:t>Por supuesto, el diseño de algoritmo es a menudo una compensación entre el tiempo y el espacio: los algoritmos con una complejidad de espacio baja pueden requerir más tiempo, y los algoritmos con una complejidad de tiempo baja pueden requerir más espacio.</w:t>
+      </w:r>
+    </w:p>
+    <w:p>
+      <w:pPr>
+        <w:pStyle w:val="Prrafodelista"/>
+        <w:numPr>
+          <w:ilvl w:val="0"/>
+          <w:numId w:val="1"/>
+        </w:numPr>
+        <w:rPr>
+          <w:rFonts w:ascii="Arial" w:hAnsi="Arial" w:cs="Arial"/>
+          <w:lang w:val="es-ES"/>
+        </w:rPr>
+      </w:pPr>
+      <w:r>
+        <w:rPr>
+          <w:rFonts w:ascii="Arial" w:hAnsi="Arial" w:cs="Arial"/>
+          <w:lang w:val="es-ES"/>
+        </w:rPr>
+        <w:t xml:space="preserve"> </w:t>
+      </w:r>
+      <w:r>
+        <w:rPr>
+          <w:rFonts w:ascii="Arial" w:hAnsi="Arial" w:cs="Arial"/>
+          <w:lang w:val="es-ES"/>
+        </w:rPr>
+        <w:br/>
+      </w:r>
+    </w:p>
+    <w:p>
+      <w:pPr>
+        <w:pStyle w:val="Prrafodelista"/>
+        <w:numPr>
+          <w:ilvl w:val="0"/>
+          <w:numId w:val="1"/>
+        </w:numPr>
+        <w:rPr>
+          <w:rFonts w:ascii="Arial" w:hAnsi="Arial" w:cs="Arial"/>
+          <w:lang w:val="es-ES"/>
+        </w:rPr>
+      </w:pPr>
+      <w:r>
+        <w:rPr>
+          <w:rFonts w:ascii="Arial" w:hAnsi="Arial" w:cs="Arial"/>
+          <w:lang w:val="es-ES"/>
+        </w:rPr>
+        <w:t xml:space="preserve"> </w:t>
+      </w:r>
+      <w:r>
+        <w:rPr>
+          <w:rFonts w:ascii="Arial" w:hAnsi="Arial" w:cs="Arial"/>
+          <w:lang w:val="es-ES"/>
+        </w:rPr>
+        <w:br/>
+      </w:r>
+    </w:p>
+    <w:p>
+      <w:pPr>
+        <w:pStyle w:val="Prrafodelista"/>
+        <w:numPr>
+          <w:ilvl w:val="0"/>
+          <w:numId w:val="1"/>
+        </w:numPr>
+        <w:rPr>
+          <w:rFonts w:ascii="Arial" w:hAnsi="Arial" w:cs="Arial"/>
+          <w:lang w:val="es-ES"/>
+        </w:rPr>
+      </w:pPr>
+      <w:r>
+        <w:rPr>
+          <w:rFonts w:ascii="Arial" w:hAnsi="Arial" w:cs="Arial"/>
+          <w:lang w:val="es-ES"/>
+        </w:rPr>
+        <w:t xml:space="preserve"> </w:t>
+      </w:r>
+      <w:hyperlink r:id="rId5" w:history="1">
+        <w:r>
+          <w:rPr>
+            <w:rStyle w:val="Hipervnculo"/>
+            <w:rFonts w:ascii="Arial" w:hAnsi="Arial" w:cs="Arial"/>
+            <w:lang w:val="es-ES"/>
+          </w:rPr>
+          <w:t>https://stackoverflow.com/questions/70402/why-is-quicksort-better-than-mergesort</w:t>
+        </w:r>
+      </w:hyperlink>
+      <w:r>
+        <w:rPr>
+          <w:rFonts w:ascii="Arial" w:hAnsi="Arial" w:cs="Arial"/>
+          <w:lang w:val="es-ES"/>
+        </w:rPr>
+        <w:t xml:space="preserve"> </w:t>
+      </w:r>
+      <w:r>
+        <w:rPr>
+          <w:rFonts w:ascii="Arial" w:hAnsi="Arial" w:cs="Arial"/>
+          <w:lang w:val="es-ES"/>
+        </w:rPr>
+        <w:br/>
+      </w:r>
+      <w:r>
+        <w:rPr>
+          <w:rFonts w:ascii="Arial" w:hAnsi="Arial" w:cs="Arial"/>
+          <w:lang w:val="es-ES"/>
+        </w:rPr>
+        <w:br/>
+      </w:r>
+      <w:r>
+        <w:rPr>
+          <w:rFonts w:ascii="Arial" w:hAnsi="Arial" w:cs="Arial"/>
+          <w:lang w:val="es-ES"/>
+        </w:rPr>
+        <w:t xml:space="preserve">En general, los dos son bastante buenos, pero tienen trade-offs que quizás los hagan mejores en situaciones bastante específicas. Por ejemplo, Merge Sort sería más eficiente cuando tengamos que ordenar datos cuya entrada provenga de un almacenamiento externo lento. QuickSort lee estos datos uno por uno en cada ciclo, mientras que Merge Sort hace una lectura secuencial de todos los datos que necesita para la partición. </w:t>
+      </w:r>
+      <w:r>
+        <w:rPr>
+          <w:rFonts w:ascii="Arial" w:hAnsi="Arial" w:cs="Arial"/>
+          <w:lang w:val="es-ES"/>
+        </w:rPr>
+        <w:br/>
+      </w:r>
+      <w:r>
+        <w:rPr>
+          <w:rFonts w:ascii="Arial" w:hAnsi="Arial" w:cs="Arial"/>
+          <w:lang w:val="es-ES"/>
+        </w:rPr>
+        <w:br/>
+        <w:t xml:space="preserve">QuickSort aprovecha bien el principio de localidad de la memoria caché, no necesita espacio extra en memoria, y con algunas mejoras, su worst-case puede ser mejorado para que sea igual que el de Merge Sort. </w:t>
+      </w:r>
+      <w:r>
+        <w:rPr>
+          <w:rFonts w:ascii="Arial" w:hAnsi="Arial" w:cs="Arial"/>
+          <w:lang w:val="es-ES"/>
+        </w:rPr>
+        <w:br/>
+      </w:r>
+      <w:r>
+        <w:rPr>
+          <w:rFonts w:ascii="Arial" w:hAnsi="Arial" w:cs="Arial"/>
+          <w:lang w:val="es-ES"/>
+        </w:rPr>
+        <w:br/>
+        <w:t xml:space="preserve">Si bien ambos son buenos, existen algoritmos más realistas, como TimSort, que se basan en asumir </w:t>
+      </w:r>
+      <w:r>
+        <w:rPr>
+          <w:rFonts w:ascii="Arial" w:hAnsi="Arial" w:cs="Arial"/>
+          <w:lang w:val="es-ES"/>
+        </w:rPr>
+        <w:t>que,</w:t>
+      </w:r>
+      <w:r>
+        <w:rPr>
+          <w:rFonts w:ascii="Arial" w:hAnsi="Arial" w:cs="Arial"/>
+          <w:lang w:val="es-ES"/>
+        </w:rPr>
+        <w:t xml:space="preserve"> en el mundo real, en promedio, los datos se presentan con cierto orden. </w:t>
+      </w:r>
+      <w:r>
+        <w:rPr>
+          <w:rFonts w:ascii="Arial" w:hAnsi="Arial" w:cs="Arial"/>
+          <w:lang w:val="es-ES"/>
+        </w:rPr>
+        <w:t>Existen variaciones basadas tanto en QuickSort como Merge Sort que son “inteligentes”, e intentan aprovecharse de esta suposición.</w:t>
+      </w:r>
+      <w:r>
+        <w:rPr>
+          <w:rFonts w:ascii="Arial" w:hAnsi="Arial" w:cs="Arial"/>
+          <w:lang w:val="es-ES"/>
+        </w:rPr>
+        <w:br/>
+      </w:r>
+    </w:p>
+    <w:p>
+      <w:pPr>
+        <w:pStyle w:val="Prrafodelista"/>
+        <w:numPr>
+          <w:ilvl w:val="0"/>
+          <w:numId w:val="1"/>
+        </w:numPr>
+        <w:rPr>
+          <w:rFonts w:ascii="Arial" w:hAnsi="Arial" w:cs="Arial"/>
+          <w:lang w:val="es-ES"/>
+        </w:rPr>
+      </w:pPr>
+      <w:r>
+        <w:rPr>
+          <w:rFonts w:ascii="Arial" w:hAnsi="Arial" w:cs="Arial"/>
+          <w:lang w:val="es-ES"/>
+        </w:rPr>
+        <w:t xml:space="preserve"> </w:t>
+      </w:r>
+      <w:r>
+        <w:rPr>
+          <w:rFonts w:ascii="Arial" w:hAnsi="Arial" w:cs="Arial"/>
+          <w:lang w:val="es-ES"/>
+        </w:rPr>
+        <w:br/>
+      </w:r>
+    </w:p>
+    <w:p>
+      <w:pPr>
+        <w:pStyle w:val="Prrafodelista"/>
+        <w:numPr>
+          <w:ilvl w:val="0"/>
+          <w:numId w:val="1"/>
+        </w:numPr>
+        <w:rPr>
+          <w:rFonts w:ascii="Arial" w:hAnsi="Arial" w:cs="Arial"/>
+          <w:lang w:val="es-ES"/>
+        </w:rPr>
+      </w:pPr>
+      <w:r>
+        <w:rPr>
+          <w:rFonts w:ascii="Arial" w:hAnsi="Arial" w:cs="Arial"/>
+          <w:lang w:val="es-ES"/>
+        </w:rPr>
+        <w:t xml:space="preserve"> </w:t>
+      </w:r>
+    </w:p>
+    <w:p>
+      <w:pPr>
+        <w:pStyle w:val="Prrafodelista"/>
+        <w:rPr>
+          <w:rFonts w:ascii="Arial" w:hAnsi="Arial" w:cs="Arial"/>
+          <w:lang w:val="es-ES"/>
+        </w:rPr>
+      </w:pPr>
+      <w:r>
+        <w:rPr>
+          <w:rFonts w:ascii="Arial" w:hAnsi="Arial" w:cs="Arial"/>
+          <w:lang w:val="es-ES"/>
+        </w:rPr>
+        <w:br/>
+      </w:r>
+    </w:p>
+    <w:p>
+      <w:pPr>
+        <w:pStyle w:val="Prrafodelista"/>
+        <w:numPr>
+          <w:ilvl w:val="0"/>
+          <w:numId w:val="1"/>
+        </w:numPr>
+        <w:rPr>
+          <w:rFonts w:ascii="Arial" w:hAnsi="Arial" w:cs="Arial"/>
+          <w:b/>
+          <w:lang w:val="es-ES"/>
+        </w:rPr>
+      </w:pPr>
+      <w:r>
+        <w:rPr>
+          <w:rFonts w:ascii="Arial" w:hAnsi="Arial" w:cs="Arial"/>
+          <w:b/>
+          <w:lang w:val="es-ES"/>
+        </w:rPr>
+        <w:lastRenderedPageBreak/>
+        <w:t>Elegir un buen pivote:</w:t>
+      </w:r>
+      <w:r>
+        <w:rPr>
+          <w:rFonts w:ascii="Arial" w:hAnsi="Arial" w:cs="Arial"/>
+          <w:b/>
+          <w:lang w:val="es-ES"/>
+        </w:rPr>
+        <w:t xml:space="preserve"> </w:t>
+      </w:r>
+      <w:r>
+        <w:rPr>
+          <w:rFonts w:ascii="Arial" w:hAnsi="Arial" w:cs="Arial"/>
+          <w:lang w:val="es-ES"/>
+        </w:rPr>
+        <w:t xml:space="preserve">una de las formas de mejorar QuickSort es a través de la elección de un pivote adecuado. </w:t>
+      </w:r>
+      <w:r>
+        <w:rPr>
+          <w:rFonts w:ascii="Arial" w:hAnsi="Arial" w:cs="Arial"/>
+          <w:lang w:val="es-ES"/>
+        </w:rPr>
+        <w:t>Generalmente se elegía al último elemento del array como el pivote, pero esto causaba un</w:t>
+      </w:r>
+      <w:r>
+        <w:rPr>
+          <w:rFonts w:ascii="Arial" w:hAnsi="Arial" w:cs="Arial"/>
+          <w:lang w:val="es-ES"/>
+        </w:rPr>
+        <w:t xml:space="preserve"> worst-case con complejidad O(n</w:t>
+      </w:r>
+      <w:r>
+        <w:rPr>
+          <w:rFonts w:ascii="Arial" w:hAnsi="Arial" w:cs="Arial"/>
+          <w:vertAlign w:val="superscript"/>
+          <w:lang w:val="es-ES"/>
+        </w:rPr>
+        <w:t>2</w:t>
+      </w:r>
+      <w:r>
+        <w:rPr>
+          <w:rFonts w:ascii="Arial" w:hAnsi="Arial" w:cs="Arial"/>
+          <w:lang w:val="es-ES"/>
+        </w:rPr>
+        <w:t xml:space="preserve">) para arrays que ya están ordenados. </w:t>
+      </w:r>
+      <w:r>
+        <w:rPr>
+          <w:rFonts w:ascii="Arial" w:hAnsi="Arial" w:cs="Arial"/>
+          <w:lang w:val="es-ES"/>
+        </w:rPr>
+        <w:br/>
+      </w:r>
+      <w:r>
+        <w:rPr>
+          <w:rFonts w:ascii="Arial" w:hAnsi="Arial" w:cs="Arial"/>
+          <w:lang w:val="es-ES"/>
+        </w:rPr>
+        <w:br/>
+        <w:t xml:space="preserve">Algunas alternativas para elegir un pivote incluyen elegir un elemento al azar del array, o hacer la mediana del primer, del último, y del elemento del medio del array. </w:t>
+      </w:r>
+      <w:r>
+        <w:rPr>
+          <w:rFonts w:ascii="Arial" w:hAnsi="Arial" w:cs="Arial"/>
+          <w:lang w:val="es-ES"/>
+        </w:rPr>
+        <w:t xml:space="preserve">Sin embargo, la forma más robusta suele ser hacer la mediana de tres elementos al azar dentro del array. </w:t>
+      </w:r>
+      <w:r>
+        <w:rPr>
+          <w:rFonts w:ascii="Arial" w:hAnsi="Arial" w:cs="Arial"/>
+          <w:lang w:val="es-ES"/>
+        </w:rPr>
+        <w:br/>
+      </w:r>
+      <w:r>
+        <w:rPr>
+          <w:rFonts w:ascii="Arial" w:hAnsi="Arial" w:cs="Arial"/>
+          <w:lang w:val="es-ES"/>
+        </w:rPr>
+        <w:br/>
+      </w:r>
+      <w:r>
+        <w:rPr>
+          <w:rFonts w:ascii="Arial" w:hAnsi="Arial" w:cs="Arial"/>
+          <w:b/>
+          <w:lang w:val="es-ES"/>
+        </w:rPr>
+        <w:t>Hacer una partición triple:</w:t>
+      </w:r>
+      <w:r>
+        <w:rPr>
+          <w:rFonts w:ascii="Arial" w:hAnsi="Arial" w:cs="Arial"/>
+          <w:b/>
+          <w:lang w:val="es-ES"/>
+        </w:rPr>
+        <w:t xml:space="preserve"> </w:t>
+      </w:r>
+      <w:r>
+        <w:rPr>
+          <w:rFonts w:ascii="Arial" w:hAnsi="Arial" w:cs="Arial"/>
+          <w:lang w:val="es-ES"/>
+        </w:rPr>
+        <w:t>la partición triple ayuda a no caer en un worst-case de O(n</w:t>
+      </w:r>
+      <w:r>
+        <w:rPr>
+          <w:rFonts w:ascii="Arial" w:hAnsi="Arial" w:cs="Arial"/>
+          <w:vertAlign w:val="superscript"/>
+          <w:lang w:val="es-ES"/>
+        </w:rPr>
+        <w:t>2</w:t>
+      </w:r>
+      <w:r>
+        <w:rPr>
+          <w:rFonts w:ascii="Arial" w:hAnsi="Arial" w:cs="Arial"/>
+          <w:lang w:val="es-ES"/>
+        </w:rPr>
+        <w:t>)</w:t>
+      </w:r>
+      <w:r>
+        <w:rPr>
+          <w:rFonts w:ascii="Arial" w:hAnsi="Arial" w:cs="Arial"/>
+          <w:lang w:val="es-ES"/>
+        </w:rPr>
+        <w:t xml:space="preserve"> al momento de ordenar un array con muchos valores iguales. </w:t>
+      </w:r>
+    </w:p>
+    <w:p>
+      <w:pPr>
+        <w:pStyle w:val="Prrafodelista"/>
+        <w:rPr>
+          <w:rFonts w:ascii="Arial" w:hAnsi="Arial" w:cs="Arial"/>
+          <w:lang w:val="es-ES"/>
+        </w:rPr>
+      </w:pPr>
+      <w:r>
+        <w:rPr>
+          <w:rFonts w:ascii="Arial" w:hAnsi="Arial" w:cs="Arial"/>
+          <w:lang w:val="es-ES"/>
+        </w:rPr>
+        <w:br/>
+      </w:r>
+      <w:r>
+        <w:rPr>
+          <w:rFonts w:ascii="Arial" w:hAnsi="Arial" w:cs="Arial"/>
+          <w:b/>
+          <w:lang w:val="es-ES"/>
+        </w:rPr>
+        <w:t>Combinar algoritmos:</w:t>
+      </w:r>
+      <w:r>
+        <w:rPr>
+          <w:rFonts w:ascii="Arial" w:hAnsi="Arial" w:cs="Arial"/>
+          <w:b/>
+          <w:lang w:val="es-ES"/>
+        </w:rPr>
+        <w:t xml:space="preserve"> </w:t>
+      </w:r>
+      <w:r>
+        <w:rPr>
+          <w:rFonts w:ascii="Arial" w:hAnsi="Arial" w:cs="Arial"/>
+          <w:lang w:val="es-ES"/>
+        </w:rPr>
+        <w:t xml:space="preserve">otra de las formas más comunes de mejorar QS es a través del uso de otros algoritmos de ordenamiento cuando la entrada posee una cantidad de elementos baja. </w:t>
+      </w:r>
+      <w:r>
+        <w:rPr>
+          <w:rFonts w:ascii="Arial" w:hAnsi="Arial" w:cs="Arial"/>
+          <w:lang w:val="es-ES"/>
+        </w:rPr>
+        <w:t>Generalmente, se usa el algoritmo de inserción para ordenar entradas cortas, y QS las demás.</w:t>
+      </w:r>
+    </w:p>
+    <w:p>
+      <w:pPr>
+        <w:pStyle w:val="Prrafodelista"/>
+        <w:rPr>
+          <w:rFonts w:ascii="Arial" w:hAnsi="Arial" w:cs="Arial"/>
+          <w:lang w:val="es-ES"/>
+        </w:rPr>
+      </w:pPr>
+    </w:p>
+    <w:p>
+      <w:pPr>
+        <w:pStyle w:val="Prrafodelista"/>
+        <w:numPr>
+          <w:ilvl w:val="0"/>
+          <w:numId w:val="1"/>
+        </w:numPr>
+        <w:rPr>
+          <w:rFonts w:ascii="Arial" w:hAnsi="Arial" w:cs="Arial"/>
+          <w:lang w:val="es-ES"/>
+        </w:rPr>
+      </w:pPr>
+      <w:r>
+        <w:rPr>
+          <w:rFonts w:ascii="Arial" w:hAnsi="Arial" w:cs="Arial"/>
+          <w:lang w:val="es-ES"/>
+        </w:rPr>
+        <w:t>Ni idea.</w:t>
+      </w:r>
+      <w:r>
+        <w:rPr>
+          <w:rFonts w:ascii="Arial" w:hAnsi="Arial" w:cs="Arial"/>
+          <w:lang w:val="es-ES"/>
+        </w:rPr>
+        <w:br/>
+      </w:r>
+    </w:p>
+    <w:p>
+      <w:pPr>
+        <w:pStyle w:val="Prrafodelista"/>
+        <w:numPr>
+          <w:ilvl w:val="0"/>
+          <w:numId w:val="1"/>
+        </w:numPr>
+        <w:rPr>
+          <w:rFonts w:ascii="Arial" w:hAnsi="Arial" w:cs="Arial"/>
+          <w:lang w:val="es-ES"/>
+        </w:rPr>
+      </w:pPr>
+      <w:r>
+        <w:rPr>
+          <w:rFonts w:ascii="Arial" w:hAnsi="Arial" w:cs="Arial"/>
+          <w:lang w:val="es-ES"/>
+        </w:rPr>
+        <w:t>QS para listas largas, inserción para listas cortas. Inserción resulta más eficiente en ese caso porque no utiliza recursividad, es más estable, y requiere menos memoria que QS.</w:t>
+      </w:r>
+      <w:r>
+        <w:rPr>
+          <w:rFonts w:ascii="Arial" w:hAnsi="Arial" w:cs="Arial"/>
+          <w:lang w:val="es-ES"/>
+        </w:rPr>
+        <w:t xml:space="preserve"> </w:t>
+      </w:r>
+      <w:r>
+        <w:rPr>
+          <w:rFonts w:ascii="Arial" w:hAnsi="Arial" w:cs="Arial"/>
+          <w:lang w:val="es-ES"/>
+        </w:rPr>
+        <w:t>Es por esta razón que el algoritmo de inserción es el caso base que utilizan tanto QS y Merge Sort en sus versiones mejoradas.</w:t>
+      </w:r>
+      <w:r>
+        <w:rPr>
+          <w:rFonts w:ascii="Arial" w:hAnsi="Arial" w:cs="Arial"/>
+          <w:lang w:val="es-ES"/>
+        </w:rPr>
+        <w:br/>
+      </w:r>
+    </w:p>
+    <w:p>
+      <w:pPr>
+        <w:pStyle w:val="Prrafodelista"/>
+        <w:numPr>
+          <w:ilvl w:val="0"/>
+          <w:numId w:val="1"/>
+        </w:numPr>
+        <w:rPr>
+          <w:rFonts w:ascii="Arial" w:hAnsi="Arial" w:cs="Arial"/>
+          <w:lang w:val="es-ES"/>
+        </w:rPr>
+      </w:pPr>
+      <w:r>
+        <w:rPr>
+          <w:rFonts w:ascii="Arial" w:hAnsi="Arial" w:cs="Arial"/>
+          <w:lang w:val="es-ES"/>
+        </w:rPr>
+        <w:t xml:space="preserve"> Shell Sort puede ser visto como una generalización del Insertion Sort. </w:t>
+      </w:r>
+      <w:r>
+        <w:rPr>
+          <w:rFonts w:ascii="Arial" w:hAnsi="Arial" w:cs="Arial"/>
+          <w:lang w:val="es-ES"/>
+        </w:rPr>
+        <w:t xml:space="preserve">Shell Sort realiza comparaciones de elementos que están alejados, mientras que Insertion Sort hace comparaciones con elementos contiguos. Esto hace que Shell sea más rápido, pero en contraste que Insertion sea estable. </w:t>
+      </w:r>
+    </w:p>
+    <w:p>
+      <w:pPr>
+        <w:ind w:left="720"/>
+        <w:rPr>
+          <w:rFonts w:ascii="Arial" w:hAnsi="Arial" w:cs="Arial"/>
+          <w:lang w:val="es-ES"/>
+        </w:rPr>
+      </w:pPr>
+      <w:r>
+        <w:rPr>
+          <w:rFonts w:ascii="Arial" w:hAnsi="Arial" w:cs="Arial"/>
+          <w:lang w:val="es-ES"/>
+        </w:rPr>
+        <w:t>Insertion Sort tiene una complejidad de O(n</w:t>
+      </w:r>
+      <w:r>
+        <w:rPr>
+          <w:rFonts w:ascii="Arial" w:hAnsi="Arial" w:cs="Arial"/>
+          <w:vertAlign w:val="superscript"/>
+          <w:lang w:val="es-ES"/>
+        </w:rPr>
+        <w:t>2</w:t>
+      </w:r>
+      <w:r>
+        <w:rPr>
+          <w:rFonts w:ascii="Arial" w:hAnsi="Arial" w:cs="Arial"/>
+          <w:lang w:val="es-ES"/>
+        </w:rPr>
+        <w:t>) y Shell Sort tiene una complejidad que ronda por O(n</w:t>
+      </w:r>
+      <w:r>
+        <w:rPr>
+          <w:rFonts w:ascii="Arial" w:hAnsi="Arial" w:cs="Arial"/>
+          <w:vertAlign w:val="superscript"/>
+          <w:lang w:val="es-ES"/>
+        </w:rPr>
+        <w:t>5/4</w:t>
+      </w:r>
+      <w:r>
+        <w:rPr>
+          <w:rFonts w:ascii="Arial" w:hAnsi="Arial" w:cs="Arial"/>
+          <w:lang w:val="es-ES"/>
+        </w:rPr>
+        <w:t xml:space="preserve">). </w:t>
+      </w:r>
+    </w:p>
+    <w:p>
+      <w:pPr>
+        <w:pStyle w:val="Prrafodelista"/>
+        <w:numPr>
+          <w:ilvl w:val="0"/>
+          <w:numId w:val="1"/>
+        </w:numPr>
+        <w:rPr>
+          <w:rFonts w:ascii="Arial" w:hAnsi="Arial" w:cs="Arial"/>
+          <w:lang w:val="es-ES"/>
+        </w:rPr>
+      </w:pPr>
+      <w:r>
+        <w:rPr>
+          <w:rFonts w:ascii="Arial" w:hAnsi="Arial" w:cs="Arial"/>
+          <w:lang w:val="es-ES"/>
+        </w:rPr>
+        <w:t xml:space="preserve"> </w:t>
+      </w:r>
+      <w:r>
+        <w:rPr>
+          <w:rFonts w:ascii="Arial" w:hAnsi="Arial" w:cs="Arial"/>
+          <w:lang w:val="es-ES"/>
+        </w:rPr>
+        <w:t xml:space="preserve">No hay un algoritmo que sea el mejor en todas las situaciones, sin embargo, para uso en casos del mundo real, Timsort resulta ser uno de los mejores, y como el mismo está basado en MergeSort y el algoritmo de inserción, elijo a esos dos como los mejores. </w:t>
+      </w:r>
+      <w:r>
+        <w:rPr>
+          <w:rFonts w:ascii="Arial" w:hAnsi="Arial" w:cs="Arial"/>
+          <w:lang w:val="es-ES"/>
+        </w:rPr>
+        <w:br/>
+      </w:r>
+    </w:p>
+    <w:p>
+      <w:pPr>
+        <w:pStyle w:val="Prrafodelista"/>
+        <w:numPr>
+          <w:ilvl w:val="0"/>
+          <w:numId w:val="1"/>
+        </w:numPr>
+        <w:rPr>
+          <w:rFonts w:ascii="Arial" w:hAnsi="Arial" w:cs="Arial"/>
+          <w:lang w:val="es-ES"/>
+        </w:rPr>
+      </w:pPr>
+      <w:r>
+        <w:rPr>
+          <w:rFonts w:ascii="Arial" w:hAnsi="Arial" w:cs="Arial"/>
+          <w:lang w:val="es-ES"/>
+        </w:rPr>
+        <w:t>La entrada ya estaba ordenada. Usar QS con las mejoras nombradas anteriormente (3-way partitioning) para no caer en ese escenario.</w:t>
+      </w:r>
+      <w:r>
+        <w:rPr>
+          <w:rFonts w:ascii="Arial" w:hAnsi="Arial" w:cs="Arial"/>
+          <w:lang w:val="es-ES"/>
+        </w:rPr>
+        <w:t xml:space="preserve"> </w:t>
+      </w:r>
+      <w:r>
+        <w:rPr>
+          <w:rFonts w:ascii="Arial" w:hAnsi="Arial" w:cs="Arial"/>
+          <w:lang w:val="es-ES"/>
+        </w:rPr>
+        <w:br/>
+      </w:r>
+    </w:p>
+    <w:p>
+      <w:pPr>
+        <w:pStyle w:val="Prrafodelista"/>
+        <w:numPr>
+          <w:ilvl w:val="0"/>
+          <w:numId w:val="1"/>
+        </w:numPr>
+        <w:rPr>
+          <w:rFonts w:ascii="Arial" w:hAnsi="Arial" w:cs="Arial"/>
+          <w:lang w:val="es-ES"/>
+        </w:rPr>
+      </w:pPr>
+      <w:r>
+        <w:rPr>
+          <w:rFonts w:ascii="Arial" w:hAnsi="Arial" w:cs="Arial"/>
+          <w:lang w:val="es-ES"/>
+        </w:rPr>
+        <w:t xml:space="preserve"> </w:t>
+      </w:r>
+      <w:hyperlink r:id="rId6" w:history="1">
+        <w:r>
+          <w:rPr>
+            <w:rStyle w:val="Hipervnculo"/>
+            <w:rFonts w:ascii="Arial" w:hAnsi="Arial" w:cs="Arial"/>
+            <w:lang w:val="es-ES"/>
+          </w:rPr>
+          <w:t>https://www.toptal.com/developers/sorting-algorithms/nearly-sorted-initial-order</w:t>
+        </w:r>
+      </w:hyperlink>
+      <w:r>
+        <w:rPr>
+          <w:rFonts w:ascii="Arial" w:hAnsi="Arial" w:cs="Arial"/>
+          <w:lang w:val="es-ES"/>
+        </w:rPr>
+        <w:t xml:space="preserve"> </w:t>
+      </w:r>
+      <w:r>
+        <w:rPr>
+          <w:rFonts w:ascii="Arial" w:hAnsi="Arial" w:cs="Arial"/>
+          <w:lang w:val="es-ES"/>
+        </w:rPr>
+        <w:br/>
+      </w:r>
+      <w:r>
+        <w:rPr>
+          <w:rFonts w:ascii="Arial" w:hAnsi="Arial" w:cs="Arial"/>
+          <w:lang w:val="es-ES"/>
+        </w:rPr>
+        <w:br/>
+        <w:t>El algoritmo de inserción resulta ser el más rápido.</w:t>
+      </w:r>
+      <w:r>
+        <w:rPr>
+          <w:rFonts w:ascii="Arial" w:hAnsi="Arial" w:cs="Arial"/>
+          <w:lang w:val="es-ES"/>
+        </w:rPr>
+        <w:t xml:space="preserve"> </w:t>
+      </w:r>
+      <w:r>
+        <w:rPr>
+          <w:rFonts w:ascii="Arial" w:hAnsi="Arial" w:cs="Arial"/>
+          <w:lang w:val="es-ES"/>
+        </w:rPr>
+        <w:br/>
+      </w:r>
+    </w:p>
+    <w:p>
+      <w:pPr>
+        <w:pStyle w:val="Prrafodelista"/>
+        <w:numPr>
+          <w:ilvl w:val="0"/>
+          <w:numId w:val="1"/>
+        </w:numPr>
+        <w:rPr>
+          <w:rFonts w:ascii="Arial" w:hAnsi="Arial" w:cs="Arial"/>
+          <w:lang w:val="es-ES"/>
+        </w:rPr>
+      </w:pPr>
+      <w:r>
+        <w:rPr>
+          <w:rFonts w:ascii="Arial" w:hAnsi="Arial" w:cs="Arial"/>
+          <w:lang w:val="es-ES"/>
+        </w:rPr>
+        <w:t xml:space="preserve">El tiempo de ejecución varía mucho dependiendo de la entrada y del algoritmo utilizado. No hay ninguno que asegure realmente un tiempo de ejecución mínimo en todos los casos, ni QuickSort con todas sus posibles mejoras. </w:t>
+      </w:r>
+      <w:r>
+        <w:rPr>
+          <w:rFonts w:ascii="Arial" w:hAnsi="Arial" w:cs="Arial"/>
+          <w:lang w:val="es-ES"/>
+        </w:rPr>
+        <w:t>Si hablamos en promedio, volvemos a la discusión de si utilizar QuickSort o MergeSort.</w:t>
+      </w:r>
+      <w:r>
+        <w:rPr>
+          <w:rFonts w:ascii="Arial" w:hAnsi="Arial" w:cs="Arial"/>
+          <w:lang w:val="es-ES"/>
+        </w:rPr>
+        <w:t xml:space="preserve"> </w:t>
+      </w:r>
+    </w:p>
+    <w:p>
+      <w:pPr>
+        <w:pStyle w:val="Prrafodelista"/>
+        <w:numPr>
+          <w:ilvl w:val="0"/>
+          <w:numId w:val="1"/>
+        </w:numPr>
+        <w:rPr>
+          <w:rFonts w:ascii="Arial" w:hAnsi="Arial" w:cs="Arial"/>
+          <w:lang w:val="es-ES"/>
+        </w:rPr>
+      </w:pPr>
+      <w:r>
+        <w:rPr>
+          <w:rFonts w:ascii="Arial" w:hAnsi="Arial" w:cs="Arial"/>
+          <w:lang w:val="es-ES"/>
+        </w:rPr>
+        <w:lastRenderedPageBreak/>
+        <w:t xml:space="preserve">MergeSort, debido a que, al trabajar con una lista, el principio de localidad de la cache del que tanto se aprovecha QuickSort se ve totalmente anulado. Las direcciones de memoria de los elementos de la lista no tienen por qué ser contiguas, y esto causa que se reduzca la eficiencia en QS. </w:t>
+      </w:r>
+      <w:r>
+        <w:rPr>
+          <w:rFonts w:ascii="Arial" w:hAnsi="Arial" w:cs="Arial"/>
+          <w:lang w:val="es-ES"/>
+        </w:rPr>
+        <w:br/>
+      </w:r>
+      <w:r>
+        <w:rPr>
+          <w:rFonts w:ascii="Arial" w:hAnsi="Arial" w:cs="Arial"/>
+          <w:lang w:val="es-ES"/>
+        </w:rPr>
+        <w:br/>
+      </w:r>
+      <w:hyperlink r:id="rId7" w:history="1">
+        <w:r>
+          <w:rPr>
+            <w:rStyle w:val="Hipervnculo"/>
+            <w:rFonts w:ascii="Arial" w:hAnsi="Arial" w:cs="Arial"/>
+            <w:lang w:val="es-ES"/>
+          </w:rPr>
+          <w:t>https://stackoverflow.com/questions/7629904/why-is-mergesort-better-for-linked-lists</w:t>
+        </w:r>
+      </w:hyperlink>
+      <w:r>
+        <w:rPr>
+          <w:rFonts w:ascii="Arial" w:hAnsi="Arial" w:cs="Arial"/>
+          <w:lang w:val="es-ES"/>
+        </w:rPr>
+        <w:t xml:space="preserve"> </w:t>
       </w:r>
       <w:bookmarkStart w:id="0" w:name="_GoBack"/>
       <w:bookmarkEnd w:id="0"/>
@@ -61,10 +1960,159 @@
 <file path=word/numbering.xml><?xml version="1.0" encoding="utf-8"?>
 <w:numbering xmlns:wpc="http://schemas.microsoft.com/office/word/2010/wordprocessingCanvas" xmlns:cx="http://schemas.microsoft.com/office/drawing/2014/chartex" xmlns:cx1="http://schemas.microsoft.com/office/drawing/2015/9/8/chartex" xmlns:mc="http://schemas.openxmlformats.org/markup-compatibility/2006" xmlns:o="urn:schemas-microsoft-com:office:office" xmlns:r="http://schemas.openxmlformats.org/officeDocument/2006/relationships" xmlns:m="http://schemas.openxmlformats.org/officeDocument/2006/math" xmlns:v="urn:schemas-microsoft-com:vml" xmlns:wp14="http://schemas.microsoft.com/office/word/2010/wordprocessingDrawing" xmlns:wp="http://schemas.openxmlformats.org/drawingml/2006/wordprocessingDrawing" xmlns:w10="urn:schemas-microsoft-com:office:word" xmlns:w="http://schemas.openxmlformats.org/wordprocessingml/2006/main" xmlns:w14="http://schemas.microsoft.com/office/word/2010/wordml" xmlns:w15="http://schemas.microsoft.com/office/word/2012/wordml" xmlns:w16se="http://schemas.microsoft.com/office/word/2015/wordml/symex" xmlns:wpg="http://schemas.microsoft.com/office/word/2010/wordprocessingGroup" xmlns:wpi="http://schemas.microsoft.com/office/word/2010/wordprocessingInk" xmlns:wne="http://schemas.microsoft.com/office/word/2006/wordml" xmlns:wps="http://schemas.microsoft.com/office/word/2010/wordprocessingShape" mc:Ignorable="w14 w15 w16se wp14">
   <w:abstractNum w:abstractNumId="0" w15:restartNumberingAfterBreak="0">
+    <w:nsid w:val="4A42140B"/>
+    <w:multiLevelType w:val="multilevel"/>
+    <w:tmpl w:val="5CEAD988"/>
+    <w:lvl w:ilvl="0">
+      <w:start w:val="1"/>
+      <w:numFmt w:val="bullet"/>
+      <w:lvlText w:val=""/>
+      <w:lvlJc w:val="left"/>
+      <w:pPr>
+        <w:tabs>
+          <w:tab w:val="num" w:pos="1080"/>
+        </w:tabs>
+        <w:ind w:left="1080" w:hanging="360"/>
+      </w:pPr>
+      <w:rPr>
+        <w:rFonts w:ascii="Symbol" w:hAnsi="Symbol" w:hint="default"/>
+        <w:sz w:val="20"/>
+      </w:rPr>
+    </w:lvl>
+    <w:lvl w:ilvl="1" w:tentative="1">
+      <w:start w:val="1"/>
+      <w:numFmt w:val="bullet"/>
+      <w:lvlText w:val="o"/>
+      <w:lvlJc w:val="left"/>
+      <w:pPr>
+        <w:tabs>
+          <w:tab w:val="num" w:pos="1800"/>
+        </w:tabs>
+        <w:ind w:left="1800" w:hanging="360"/>
+      </w:pPr>
+      <w:rPr>
+        <w:rFonts w:ascii="Courier New" w:hAnsi="Courier New" w:hint="default"/>
+        <w:sz w:val="20"/>
+      </w:rPr>
+    </w:lvl>
+    <w:lvl w:ilvl="2" w:tentative="1">
+      <w:start w:val="1"/>
+      <w:numFmt w:val="bullet"/>
+      <w:lvlText w:val=""/>
+      <w:lvlJc w:val="left"/>
+      <w:pPr>
+        <w:tabs>
+          <w:tab w:val="num" w:pos="2520"/>
+        </w:tabs>
+        <w:ind w:left="2520" w:hanging="360"/>
+      </w:pPr>
+      <w:rPr>
+        <w:rFonts w:ascii="Wingdings" w:hAnsi="Wingdings" w:hint="default"/>
+        <w:sz w:val="20"/>
+      </w:rPr>
+    </w:lvl>
+    <w:lvl w:ilvl="3" w:tentative="1">
+      <w:start w:val="1"/>
+      <w:numFmt w:val="bullet"/>
+      <w:lvlText w:val=""/>
+      <w:lvlJc w:val="left"/>
+      <w:pPr>
+        <w:tabs>
+          <w:tab w:val="num" w:pos="3240"/>
+        </w:tabs>
+        <w:ind w:left="3240" w:hanging="360"/>
+      </w:pPr>
+      <w:rPr>
+        <w:rFonts w:ascii="Wingdings" w:hAnsi="Wingdings" w:hint="default"/>
+        <w:sz w:val="20"/>
+      </w:rPr>
+    </w:lvl>
+    <w:lvl w:ilvl="4" w:tentative="1">
+      <w:start w:val="1"/>
+      <w:numFmt w:val="bullet"/>
+      <w:lvlText w:val=""/>
+      <w:lvlJc w:val="left"/>
+      <w:pPr>
+        <w:tabs>
+          <w:tab w:val="num" w:pos="3960"/>
+        </w:tabs>
+        <w:ind w:left="3960" w:hanging="360"/>
+      </w:pPr>
+      <w:rPr>
+        <w:rFonts w:ascii="Wingdings" w:hAnsi="Wingdings" w:hint="default"/>
+        <w:sz w:val="20"/>
+      </w:rPr>
+    </w:lvl>
+    <w:lvl w:ilvl="5" w:tentative="1">
+      <w:start w:val="1"/>
+      <w:numFmt w:val="bullet"/>
+      <w:lvlText w:val=""/>
+      <w:lvlJc w:val="left"/>
+      <w:pPr>
+        <w:tabs>
+          <w:tab w:val="num" w:pos="4680"/>
+        </w:tabs>
+        <w:ind w:left="4680" w:hanging="360"/>
+      </w:pPr>
+      <w:rPr>
+        <w:rFonts w:ascii="Wingdings" w:hAnsi="Wingdings" w:hint="default"/>
+        <w:sz w:val="20"/>
+      </w:rPr>
+    </w:lvl>
+    <w:lvl w:ilvl="6" w:tentative="1">
+      <w:start w:val="1"/>
+      <w:numFmt w:val="bullet"/>
+      <w:lvlText w:val=""/>
+      <w:lvlJc w:val="left"/>
+      <w:pPr>
+        <w:tabs>
+          <w:tab w:val="num" w:pos="5400"/>
+        </w:tabs>
+        <w:ind w:left="5400" w:hanging="360"/>
+      </w:pPr>
+      <w:rPr>
+        <w:rFonts w:ascii="Wingdings" w:hAnsi="Wingdings" w:hint="default"/>
+        <w:sz w:val="20"/>
+      </w:rPr>
+    </w:lvl>
+    <w:lvl w:ilvl="7" w:tentative="1">
+      <w:start w:val="1"/>
+      <w:numFmt w:val="bullet"/>
+      <w:lvlText w:val=""/>
+      <w:lvlJc w:val="left"/>
+      <w:pPr>
+        <w:tabs>
+          <w:tab w:val="num" w:pos="6120"/>
+        </w:tabs>
+        <w:ind w:left="6120" w:hanging="360"/>
+      </w:pPr>
+      <w:rPr>
+        <w:rFonts w:ascii="Wingdings" w:hAnsi="Wingdings" w:hint="default"/>
+        <w:sz w:val="20"/>
+      </w:rPr>
+    </w:lvl>
+    <w:lvl w:ilvl="8" w:tentative="1">
+      <w:start w:val="1"/>
+      <w:numFmt w:val="bullet"/>
+      <w:lvlText w:val=""/>
+      <w:lvlJc w:val="left"/>
+      <w:pPr>
+        <w:tabs>
+          <w:tab w:val="num" w:pos="6840"/>
+        </w:tabs>
+        <w:ind w:left="6840" w:hanging="360"/>
+      </w:pPr>
+      <w:rPr>
+        <w:rFonts w:ascii="Wingdings" w:hAnsi="Wingdings" w:hint="default"/>
+        <w:sz w:val="20"/>
+      </w:rPr>
+    </w:lvl>
+  </w:abstractNum>
+  <w:abstractNum w:abstractNumId="1" w15:restartNumberingAfterBreak="0">
     <w:nsid w:val="53C45621"/>
     <w:multiLevelType w:val="hybridMultilevel"/>
-    <w:tmpl w:val="9BB865D4"/>
-    <w:lvl w:ilvl="0" w:tplc="04090011">
+    <w:tmpl w:val="2370F41E"/>
+    <w:lvl w:ilvl="0" w:tplc="C2F24978">
       <w:start w:val="1"/>
       <w:numFmt w:val="decimal"/>
       <w:lvlText w:val="%1)"/>
@@ -74,6 +2122,7 @@
       </w:pPr>
       <w:rPr>
         <w:rFonts w:hint="default"/>
+        <w:b w:val="0"/>
       </w:rPr>
     </w:lvl>
     <w:lvl w:ilvl="1" w:tplc="04090019" w:tentative="1">
@@ -150,6 +2199,9 @@
     </w:lvl>
   </w:abstractNum>
   <w:num w:numId="1">
+    <w:abstractNumId w:val="1"/>
+  </w:num>
+  <w:num w:numId="2">
     <w:abstractNumId w:val="0"/>
   </w:num>
 </w:numbering>
@@ -587,6 +2639,63 @@
       <w:contextualSpacing/>
     </w:pPr>
   </w:style>
+  <w:style w:type="table" w:styleId="Tablaconcuadrcula">
+    <w:name w:val="Table Grid"/>
+    <w:basedOn w:val="Tablanormal"/>
+    <w:uiPriority w:val="39"/>
+    <w:rsid w:val="00B37D12"/>
+    <w:pPr>
+      <w:spacing w:after="0" w:line="240" w:lineRule="auto"/>
+    </w:pPr>
+    <w:tblPr>
+      <w:tblBorders>
+        <w:top w:val="single" w:sz="4" w:space="0" w:color="auto"/>
+        <w:left w:val="single" w:sz="4" w:space="0" w:color="auto"/>
+        <w:bottom w:val="single" w:sz="4" w:space="0" w:color="auto"/>
+        <w:right w:val="single" w:sz="4" w:space="0" w:color="auto"/>
+        <w:insideH w:val="single" w:sz="4" w:space="0" w:color="auto"/>
+        <w:insideV w:val="single" w:sz="4" w:space="0" w:color="auto"/>
+      </w:tblBorders>
+    </w:tblPr>
+  </w:style>
+  <w:style w:type="paragraph" w:styleId="NormalWeb">
+    <w:name w:val="Normal (Web)"/>
+    <w:basedOn w:val="Normal"/>
+    <w:uiPriority w:val="99"/>
+    <w:semiHidden/>
+    <w:unhideWhenUsed/>
+    <w:rsid w:val="009372E0"/>
+    <w:pPr>
+      <w:spacing w:before="100" w:beforeAutospacing="1" w:after="100" w:afterAutospacing="1" w:line="240" w:lineRule="auto"/>
+    </w:pPr>
+    <w:rPr>
+      <w:rFonts w:ascii="Times New Roman" w:eastAsia="Times New Roman" w:hAnsi="Times New Roman" w:cs="Times New Roman"/>
+      <w:sz w:val="24"/>
+      <w:szCs w:val="24"/>
+    </w:rPr>
+  </w:style>
+  <w:style w:type="character" w:styleId="Hipervnculo">
+    <w:name w:val="Hyperlink"/>
+    <w:basedOn w:val="Fuentedeprrafopredeter"/>
+    <w:uiPriority w:val="99"/>
+    <w:unhideWhenUsed/>
+    <w:rsid w:val="009372E0"/>
+    <w:rPr>
+      <w:color w:val="0000FF"/>
+      <w:u w:val="single"/>
+    </w:rPr>
+  </w:style>
+  <w:style w:type="character" w:styleId="Textoennegrita">
+    <w:name w:val="Strong"/>
+    <w:basedOn w:val="Fuentedeprrafopredeter"/>
+    <w:uiPriority w:val="22"/>
+    <w:qFormat/>
+    <w:rsid w:val="009372E0"/>
+    <w:rPr>
+      <w:b/>
+      <w:bCs/>
+    </w:rPr>
+  </w:style>
 </w:styles>
 </file>
 

</xml_diff>